<commit_message>
Rename figures: figure1_forest, figure2_event_panels; remove deprecated 5-outcome figure and scripts
- figures/fig1_event_study.{png,pdf} deleted (deprecated 5-outcome version)
- figures/fig2_forest_all_outcomes.* -> figure1_forest.*
- figures/fig3_event_panels.* -> figure2_event_panels.*
- scripts/04_figures.py and 10_build_docx.py removed (superseded)
- All references in scripts and manuscript updated
- Email markdown synced with public-repo language

Co-Authored-By: Claude Opus 4.7 (1M context) <noreply@anthropic.com>
</commit_message>
<xml_diff>
--- a/manuscript/manuscript_jhcpu.docx
+++ b/manuscript/manuscript_jhcpu.docx
@@ -1651,7 +1651,7 @@
               <a:graphicData uri="http://schemas.openxmlformats.org/drawingml/2006/picture">
                 <pic:pic>
                   <pic:nvPicPr>
-                    <pic:cNvPr id="0" name="fig2_forest_all_outcomes.png"/>
+                    <pic:cNvPr id="0" name="figure1_forest.png"/>
                     <pic:cNvPicPr/>
                   </pic:nvPicPr>
                   <pic:blipFill>
@@ -1716,7 +1716,7 @@
               <a:graphicData uri="http://schemas.openxmlformats.org/drawingml/2006/picture">
                 <pic:pic>
                   <pic:nvPicPr>
-                    <pic:cNvPr id="0" name="fig3_event_panels.png"/>
+                    <pic:cNvPr id="0" name="figure2_event_panels.png"/>
                     <pic:cNvPicPr/>
                   </pic:nvPicPr>
                   <pic:blipFill>

</xml_diff>